<commit_message>
Math and history-of-medicine updates, each with an animated figure
Science: the Rotstein project is now signalling pathways in neurological disease,
with a toy model of receptor desensitization whose feedback can be weakened.
History of medicine: Quinlan to Cruzan and the three physician-authors, with a
1970-2020 timeline. CV entries updated to match.

Co-Authored-By: Claude Opus 5.5 <noreply@anthropic.com>
Claude-Session: https://claude.ai/code/session_017EfKK6WzY1iVX3LxKxgpcK
</commit_message>
<xml_diff>
--- a/cv/cv.docx
+++ b/cv/cv.docx
@@ -268,7 +268,7 @@
         <w:rPr>
           <w:b/>
         </w:rPr>
-        <w:t xml:space="preserve">simplifying &amp; modeling biophysical neuron systems</w:t>
+        <w:t xml:space="preserve">signal transduction pathways in neurological disease</w:t>
       </w:r>
       <w:r>
         <w:t xml:space="preserve"> (Dr Horacio Rotstein, in progress); American medicine &amp; end-of-life care (Dr Stephen Pemberton, in progress); intellectual history in the early modern Khalsa (Harvard Sikh Center &amp; Satnam Singh, in progress)</w:t>
@@ -628,7 +628,7 @@
         <w:ind w:left="300" w:hanging="220"/>
       </w:pPr>
       <w:r>
-        <w:t xml:space="preserve">Derive reduced mathematical descriptions of biophysical neuronal models and characterize the dynamical properties retained by the reduced systems.</w:t>
+        <w:t xml:space="preserve">Model signal transduction pathways in neurological disease as dynamical systems, beginning with GRK/beta-arrestin receptor desensitization as a negative-feedback adaptation motif.</w:t>
       </w:r>
     </w:p>
     <w:p>
@@ -855,7 +855,38 @@
         <w:ind w:left="300" w:hanging="220"/>
       </w:pPr>
       <w:r>
-        <w:t xml:space="preserve">Synthesize legal, clinical and cultural developments in American end-of-life care from the late twentieth century to today; develop scholarship intended for submission to a peer-reviewed humanities journal.</w:t>
+        <w:t xml:space="preserve">Trace the legal history of end-of-life decision-making from </w:t>
+      </w:r>
+      <w:r>
+        <w:rPr>
+          <w:i/>
+        </w:rPr>
+        <w:t xml:space="preserve">In re Quinlan</w:t>
+      </w:r>
+      <w:r>
+        <w:t xml:space="preserve"> (1976) to </w:t>
+      </w:r>
+      <w:r>
+        <w:rPr>
+          <w:i/>
+        </w:rPr>
+        <w:t xml:space="preserve">Cruzan v. Director, Missouri Department of Health</w:t>
+      </w:r>
+      <w:r>
+        <w:t xml:space="preserve"> (1990).</w:t>
+      </w:r>
+    </w:p>
+    <w:p>
+      <w:pPr>
+        <w:numPr>
+          <w:ilvl w:val="0"/>
+          <w:numId w:val="1"/>
+        </w:numPr>
+        <w:spacing w:before="0" w:after="0"/>
+        <w:ind w:left="300" w:hanging="220"/>
+      </w:pPr>
+      <w:r>
+        <w:t xml:space="preserve">Compare how three physician-authors, Sherwin Nuland, Atul Gawande and Haider Warraich, account for dying in modern American medicine; develop scholarship intended for submission to a peer-reviewed humanities journal.</w:t>
       </w:r>
     </w:p>
     <w:p>

</xml_diff>

<commit_message>
Rotstein project is the MAPK/ERK pathway in cancer, not neurological signalling
The science figure is now a toy Ras-Raf-MEK-ERK cascade with ERK feedback onto Raf,
a button to lock Raf on and one to add a MEK inhibitor. CV entry, about page and
site descriptions follow.

Co-Authored-By: Claude Opus 5.5 <noreply@anthropic.com>
Claude-Session: https://claude.ai/code/session_017EfKK6WzY1iVX3LxKxgpcK
</commit_message>
<xml_diff>
--- a/cv/cv.docx
+++ b/cv/cv.docx
@@ -268,7 +268,7 @@
         <w:rPr>
           <w:b/>
         </w:rPr>
-        <w:t xml:space="preserve">signal transduction pathways in neurological disease</w:t>
+        <w:t xml:space="preserve">simplifying &amp; modeling the MAPK/ERK pathway for therapeutic intervention</w:t>
       </w:r>
       <w:r>
         <w:t xml:space="preserve"> (Dr Horacio Rotstein, in progress); American medicine &amp; end-of-life care (Dr Stephen Pemberton, in progress); intellectual history in the early modern Khalsa (Harvard Sikh Center &amp; Satnam Singh, in progress)</w:t>
@@ -592,7 +592,7 @@
         <w:rPr>
           <w:b/>
         </w:rPr>
-        <w:t xml:space="preserve">Undergraduate Researcher, Mathematical Neuroscience</w:t>
+        <w:t xml:space="preserve">Undergraduate Researcher, Systems Biology</w:t>
       </w:r>
       <w:r>
         <w:tab/>
@@ -628,7 +628,7 @@
         <w:ind w:left="300" w:hanging="220"/>
       </w:pPr>
       <w:r>
-        <w:t xml:space="preserve">Model signal transduction pathways in neurological disease as dynamical systems, beginning with GRK/beta-arrestin receptor desensitization as a negative-feedback adaptation motif.</w:t>
+        <w:t xml:space="preserve">Simplify and model the MAPK/ERK (Ras-Raf-MEK-ERK) signaling pathway in cancer as a dynamical system, to identify points for therapeutic intervention.</w:t>
       </w:r>
     </w:p>
     <w:p>

</xml_diff>